<commit_message>
Corpus: 8 chunks -> 67, with distractors and near-miss sections
</commit_message>
<xml_diff>
--- a/examples/corpus/handbook.docx
+++ b/examples/corpus/handbook.docx
@@ -39,6 +39,71 @@
     <w:p>
       <w:r>
         <w:t>ERR_LOCK_TIMEOUT indicates the work queue is saturated. Restart the worker pool to clear the condition.</w:t>
+      </w:r>
+    </w:p>
+    <w:p>
+      <w:pPr>
+        <w:pStyle w:val="Heading1"/>
+      </w:pPr>
+      <w:r>
+        <w:t>Leave policy</w:t>
+      </w:r>
+    </w:p>
+    <w:p>
+      <w:r>
+        <w:t>Annual leave is twenty five days plus public holidays. Requests go through the admin console.</w:t>
+      </w:r>
+    </w:p>
+    <w:p>
+      <w:pPr>
+        <w:pStyle w:val="Heading1"/>
+      </w:pPr>
+      <w:r>
+        <w:t>Expenses</w:t>
+      </w:r>
+    </w:p>
+    <w:p>
+      <w:r>
+        <w:t>Submit expenses within thirty days with a receipt attached. Approval sits with the line manager.</w:t>
+      </w:r>
+    </w:p>
+    <w:p>
+      <w:pPr>
+        <w:pStyle w:val="Heading1"/>
+      </w:pPr>
+      <w:r>
+        <w:t>Equipment</w:t>
+      </w:r>
+    </w:p>
+    <w:p>
+      <w:r>
+        <w:t>Laptops are replaced on a three year cycle. Report damage to the IT desk.</w:t>
+      </w:r>
+    </w:p>
+    <w:p>
+      <w:pPr>
+        <w:pStyle w:val="Heading1"/>
+      </w:pPr>
+      <w:r>
+        <w:t>Working hours</w:t>
+      </w:r>
+    </w:p>
+    <w:p>
+      <w:r>
+        <w:t>Core hours are ten to four in local time. Flexible start and finish times are supported.</w:t>
+      </w:r>
+    </w:p>
+    <w:p>
+      <w:pPr>
+        <w:pStyle w:val="Heading1"/>
+      </w:pPr>
+      <w:r>
+        <w:t>Probation</w:t>
+      </w:r>
+    </w:p>
+    <w:p>
+      <w:r>
+        <w:t>The probation period is six months with a review at three.</w:t>
       </w:r>
     </w:p>
     <w:sectPr>

</xml_diff>